<commit_message>
video and documents for project 13
</commit_message>
<xml_diff>
--- a/projet 13/Guide opérationnel Power BI Desktop.docx
+++ b/projet 13/Guide opérationnel Power BI Desktop.docx
@@ -29,7 +29,7 @@
           <w:rFonts w:ascii="Segoe UI Emoji" w:hAnsi="Segoe UI Emoji" w:cs="Segoe UI Emoji"/>
         </w:rPr>
         <w:pict w14:anchorId="4EFA9935">
-          <v:rect id="_x0000_i1275" style="width:0;height:1.5pt" o:hralign="center" o:hrstd="t" o:hr="t" fillcolor="#a0a0a0" stroked="f"/>
+          <v:rect id="_x0000_i1025" style="width:0;height:1.5pt" o:hralign="center" o:hrstd="t" o:hr="t" fillcolor="#a0a0a0" stroked="f"/>
         </w:pict>
       </w:r>
     </w:p>
@@ -440,7 +440,7 @@
         </w:rPr>
         <w:lastRenderedPageBreak/>
         <w:pict w14:anchorId="7ED47452">
-          <v:rect id="_x0000_i1276" style="width:0;height:1.5pt" o:hralign="center" o:hrstd="t" o:hr="t" fillcolor="#a0a0a0" stroked="f"/>
+          <v:rect id="_x0000_i1026" style="width:0;height:1.5pt" o:hralign="center" o:hrstd="t" o:hr="t" fillcolor="#a0a0a0" stroked="f"/>
         </w:pict>
       </w:r>
     </w:p>
@@ -459,6 +459,57 @@
           <w:bCs/>
         </w:rPr>
         <w:t>Étape 2 — Connexion et importation de données</w:t>
+      </w:r>
+    </w:p>
+    <w:p>
+      <w:pPr>
+        <w:rPr>
+          <w:rFonts w:ascii="Segoe UI Emoji" w:hAnsi="Segoe UI Emoji" w:cs="Segoe UI Emoji"/>
+          <w:b/>
+          <w:bCs/>
+        </w:rPr>
+      </w:pPr>
+      <w:r>
+        <w:rPr>
+          <w:rFonts w:ascii="Segoe UI Emoji" w:hAnsi="Segoe UI Emoji" w:cs="Segoe UI Emoji"/>
+          <w:b/>
+          <w:bCs/>
+        </w:rPr>
+        <w:drawing>
+          <wp:inline distT="0" distB="0" distL="0" distR="0" wp14:anchorId="17EB56FE" wp14:editId="397735E5">
+            <wp:extent cx="3499030" cy="1016052"/>
+            <wp:effectExtent l="0" t="0" r="6350" b="0"/>
+            <wp:docPr id="99270433" name="Image 1" descr="Une image contenant texte, Police, ligne, nombre&#10;&#10;Le contenu généré par l’IA peut être incorrect."/>
+            <wp:cNvGraphicFramePr>
+              <a:graphicFrameLocks xmlns:a="http://schemas.openxmlformats.org/drawingml/2006/main" noChangeAspect="1"/>
+            </wp:cNvGraphicFramePr>
+            <a:graphic xmlns:a="http://schemas.openxmlformats.org/drawingml/2006/main">
+              <a:graphicData uri="http://schemas.openxmlformats.org/drawingml/2006/picture">
+                <pic:pic xmlns:pic="http://schemas.openxmlformats.org/drawingml/2006/picture">
+                  <pic:nvPicPr>
+                    <pic:cNvPr id="99270433" name="Image 1" descr="Une image contenant texte, Police, ligne, nombre&#10;&#10;Le contenu généré par l’IA peut être incorrect."/>
+                    <pic:cNvPicPr/>
+                  </pic:nvPicPr>
+                  <pic:blipFill>
+                    <a:blip r:embed="rId8"/>
+                    <a:stretch>
+                      <a:fillRect/>
+                    </a:stretch>
+                  </pic:blipFill>
+                  <pic:spPr>
+                    <a:xfrm>
+                      <a:off x="0" y="0"/>
+                      <a:ext cx="3499030" cy="1016052"/>
+                    </a:xfrm>
+                    <a:prstGeom prst="rect">
+                      <a:avLst/>
+                    </a:prstGeom>
+                  </pic:spPr>
+                </pic:pic>
+              </a:graphicData>
+            </a:graphic>
+          </wp:inline>
+        </w:drawing>
       </w:r>
     </w:p>
     <w:p>
@@ -611,21 +662,7 @@
         <w:rPr>
           <w:rFonts w:ascii="Segoe UI Emoji" w:hAnsi="Segoe UI Emoji" w:cs="Segoe UI Emoji"/>
         </w:rPr>
-        <w:t>Fichier Ventes_2024.xlsx : onglet “</w:t>
-      </w:r>
-      <w:proofErr w:type="spellStart"/>
-      <w:r>
-        <w:rPr>
-          <w:rFonts w:ascii="Segoe UI Emoji" w:hAnsi="Segoe UI Emoji" w:cs="Segoe UI Emoji"/>
-        </w:rPr>
-        <w:t>Ventes_Mensuelles</w:t>
-      </w:r>
-      <w:proofErr w:type="spellEnd"/>
-      <w:r>
-        <w:rPr>
-          <w:rFonts w:ascii="Segoe UI Emoji" w:hAnsi="Segoe UI Emoji" w:cs="Segoe UI Emoji"/>
-        </w:rPr>
-        <w:t>” → colonnes : Date, Produit, Montant (€).</w:t>
+        <w:t>Fichier Ventes_2024.xlsx : onglet “Ventes_Mensuelles” → colonnes : Date, Produit, Montant (€).</w:t>
       </w:r>
     </w:p>
     <w:p>
@@ -734,7 +771,7 @@
           <w:rFonts w:ascii="Segoe UI Emoji" w:hAnsi="Segoe UI Emoji" w:cs="Segoe UI Emoji"/>
         </w:rPr>
       </w:pPr>
-      <w:hyperlink r:id="rId8" w:history="1">
+      <w:hyperlink r:id="rId9" w:history="1">
         <w:r>
           <w:rPr>
             <w:rStyle w:val="Lienhypertexte"/>
@@ -754,447 +791,369 @@
           <w:rFonts w:ascii="Segoe UI Emoji" w:hAnsi="Segoe UI Emoji" w:cs="Segoe UI Emoji"/>
         </w:rPr>
       </w:pPr>
-      <w:hyperlink r:id="rId9" w:history="1">
-        <w:r>
-          <w:rPr>
-            <w:rStyle w:val="Lienhypertexte"/>
-            <w:rFonts w:ascii="Segoe UI Emoji" w:hAnsi="Segoe UI Emoji" w:cs="Segoe UI Emoji"/>
-          </w:rPr>
-          <w:t xml:space="preserve">Nettoyage des données dans Power </w:t>
-        </w:r>
-        <w:proofErr w:type="spellStart"/>
-        <w:r>
-          <w:rPr>
-            <w:rStyle w:val="Lienhypertexte"/>
-            <w:rFonts w:ascii="Segoe UI Emoji" w:hAnsi="Segoe UI Emoji" w:cs="Segoe UI Emoji"/>
-          </w:rPr>
-          <w:t>Query</w:t>
-        </w:r>
-        <w:proofErr w:type="spellEnd"/>
-      </w:hyperlink>
-    </w:p>
-    <w:p>
-      <w:pPr>
-        <w:rPr>
-          <w:rFonts w:ascii="Segoe UI Emoji" w:hAnsi="Segoe UI Emoji" w:cs="Segoe UI Emoji"/>
-        </w:rPr>
-      </w:pPr>
-      <w:r>
-        <w:rPr>
-          <w:rFonts w:ascii="Segoe UI Emoji" w:hAnsi="Segoe UI Emoji" w:cs="Segoe UI Emoji"/>
-        </w:rPr>
-        <w:pict w14:anchorId="377F6779">
-          <v:rect id="_x0000_i1277" style="width:0;height:1.5pt" o:hralign="center" o:hrstd="t" o:hr="t" fillcolor="#a0a0a0" stroked="f"/>
-        </w:pict>
-      </w:r>
-    </w:p>
-    <w:p>
-      <w:pPr>
-        <w:rPr>
-          <w:rFonts w:ascii="Segoe UI Emoji" w:hAnsi="Segoe UI Emoji" w:cs="Segoe UI Emoji"/>
-          <w:b/>
-          <w:bCs/>
-        </w:rPr>
-      </w:pPr>
-      <w:r>
-        <w:rPr>
-          <w:rFonts w:ascii="Segoe UI Emoji" w:hAnsi="Segoe UI Emoji" w:cs="Segoe UI Emoji"/>
-          <w:b/>
-          <w:bCs/>
-        </w:rPr>
-        <w:t xml:space="preserve">Étape 3 — Nettoyage et transformation (Power </w:t>
-      </w:r>
-      <w:proofErr w:type="spellStart"/>
-      <w:r>
-        <w:rPr>
-          <w:rFonts w:ascii="Segoe UI Emoji" w:hAnsi="Segoe UI Emoji" w:cs="Segoe UI Emoji"/>
-          <w:b/>
-          <w:bCs/>
-        </w:rPr>
-        <w:t>Query</w:t>
-      </w:r>
-      <w:proofErr w:type="spellEnd"/>
-      <w:r>
-        <w:rPr>
-          <w:rFonts w:ascii="Segoe UI Emoji" w:hAnsi="Segoe UI Emoji" w:cs="Segoe UI Emoji"/>
-          <w:b/>
-          <w:bCs/>
-        </w:rPr>
-        <w:t>)</w:t>
-      </w:r>
-    </w:p>
-    <w:p>
-      <w:pPr>
-        <w:rPr>
-          <w:rFonts w:ascii="Segoe UI Emoji" w:hAnsi="Segoe UI Emoji" w:cs="Segoe UI Emoji"/>
-        </w:rPr>
-      </w:pPr>
-      <w:r>
-        <w:rPr>
-          <w:rFonts w:ascii="Segoe UI Emoji" w:hAnsi="Segoe UI Emoji" w:cs="Segoe UI Emoji"/>
-          <w:b/>
-          <w:bCs/>
-        </w:rPr>
-        <w:t>Procédure détaillée</w:t>
-      </w:r>
-    </w:p>
-    <w:p>
-      <w:pPr>
-        <w:numPr>
-          <w:ilvl w:val="0"/>
-          <w:numId w:val="43"/>
-        </w:numPr>
-        <w:rPr>
-          <w:rFonts w:ascii="Segoe UI Emoji" w:hAnsi="Segoe UI Emoji" w:cs="Segoe UI Emoji"/>
-        </w:rPr>
-      </w:pPr>
-      <w:r>
-        <w:rPr>
-          <w:rFonts w:ascii="Segoe UI Emoji" w:hAnsi="Segoe UI Emoji" w:cs="Segoe UI Emoji"/>
-        </w:rPr>
-        <w:t>Définir le type de chaque colonne (Date, Décimal, Entier, Texte).</w:t>
-      </w:r>
-    </w:p>
-    <w:p>
-      <w:pPr>
-        <w:numPr>
-          <w:ilvl w:val="0"/>
-          <w:numId w:val="43"/>
-        </w:numPr>
-        <w:rPr>
-          <w:rFonts w:ascii="Segoe UI Emoji" w:hAnsi="Segoe UI Emoji" w:cs="Segoe UI Emoji"/>
-        </w:rPr>
-      </w:pPr>
-      <w:r>
-        <w:rPr>
-          <w:rFonts w:ascii="Segoe UI Emoji" w:hAnsi="Segoe UI Emoji" w:cs="Segoe UI Emoji"/>
-        </w:rPr>
-        <w:t>Supprimer colonnes inutiles.</w:t>
-      </w:r>
-    </w:p>
-    <w:p>
-      <w:pPr>
-        <w:numPr>
-          <w:ilvl w:val="0"/>
-          <w:numId w:val="43"/>
-        </w:numPr>
-        <w:rPr>
-          <w:rFonts w:ascii="Segoe UI Emoji" w:hAnsi="Segoe UI Emoji" w:cs="Segoe UI Emoji"/>
-        </w:rPr>
-      </w:pPr>
-      <w:r>
-        <w:rPr>
-          <w:rFonts w:ascii="Segoe UI Emoji" w:hAnsi="Segoe UI Emoji" w:cs="Segoe UI Emoji"/>
-        </w:rPr>
-        <w:t>Nettoyer les valeurs (“</w:t>
-      </w:r>
-      <w:proofErr w:type="gramStart"/>
-      <w:r>
-        <w:rPr>
-          <w:rFonts w:ascii="Segoe UI Emoji" w:hAnsi="Segoe UI Emoji" w:cs="Segoe UI Emoji"/>
-        </w:rPr>
-        <w:t>Paris</w:t>
-      </w:r>
-      <w:r>
-        <w:rPr>
-          <w:rFonts w:ascii="Arial" w:hAnsi="Arial" w:cs="Arial"/>
-        </w:rPr>
-        <w:t> </w:t>
-      </w:r>
-      <w:r>
-        <w:rPr>
-          <w:rFonts w:ascii="Segoe UI Emoji" w:hAnsi="Segoe UI Emoji" w:cs="Segoe UI Emoji"/>
-        </w:rPr>
-        <w:t xml:space="preserve"> ”</w:t>
-      </w:r>
-      <w:proofErr w:type="gramEnd"/>
-      <w:r>
-        <w:rPr>
-          <w:rFonts w:ascii="Segoe UI Emoji" w:hAnsi="Segoe UI Emoji" w:cs="Segoe UI Emoji"/>
-        </w:rPr>
-        <w:t xml:space="preserve"> → “Paris”).</w:t>
-      </w:r>
-    </w:p>
-    <w:p>
-      <w:pPr>
-        <w:numPr>
-          <w:ilvl w:val="0"/>
-          <w:numId w:val="43"/>
-        </w:numPr>
-        <w:rPr>
-          <w:rFonts w:ascii="Segoe UI Emoji" w:hAnsi="Segoe UI Emoji" w:cs="Segoe UI Emoji"/>
-        </w:rPr>
-      </w:pPr>
-      <w:r>
-        <w:rPr>
-          <w:rFonts w:ascii="Segoe UI Emoji" w:hAnsi="Segoe UI Emoji" w:cs="Segoe UI Emoji"/>
-        </w:rPr>
-        <w:t xml:space="preserve">Remplacer codes manquants (N/A, —) par </w:t>
-      </w:r>
-      <w:proofErr w:type="spellStart"/>
-      <w:r>
-        <w:rPr>
-          <w:rFonts w:ascii="Segoe UI Emoji" w:hAnsi="Segoe UI Emoji" w:cs="Segoe UI Emoji"/>
-        </w:rPr>
-        <w:t>null</w:t>
-      </w:r>
-      <w:proofErr w:type="spellEnd"/>
-      <w:r>
-        <w:rPr>
-          <w:rFonts w:ascii="Segoe UI Emoji" w:hAnsi="Segoe UI Emoji" w:cs="Segoe UI Emoji"/>
-        </w:rPr>
-        <w:t>.</w:t>
-      </w:r>
-    </w:p>
-    <w:p>
-      <w:pPr>
-        <w:numPr>
-          <w:ilvl w:val="0"/>
-          <w:numId w:val="43"/>
-        </w:numPr>
-        <w:rPr>
-          <w:rFonts w:ascii="Segoe UI Emoji" w:hAnsi="Segoe UI Emoji" w:cs="Segoe UI Emoji"/>
-        </w:rPr>
-      </w:pPr>
-      <w:r>
-        <w:rPr>
-          <w:rFonts w:ascii="Segoe UI Emoji" w:hAnsi="Segoe UI Emoji" w:cs="Segoe UI Emoji"/>
-        </w:rPr>
-        <w:t>Renommer colonnes pour clarté et cohérence.</w:t>
-      </w:r>
-    </w:p>
-    <w:p>
-      <w:pPr>
-        <w:numPr>
-          <w:ilvl w:val="0"/>
-          <w:numId w:val="43"/>
-        </w:numPr>
-        <w:rPr>
-          <w:rFonts w:ascii="Segoe UI Emoji" w:hAnsi="Segoe UI Emoji" w:cs="Segoe UI Emoji"/>
-        </w:rPr>
-      </w:pPr>
-      <w:r>
-        <w:rPr>
-          <w:rFonts w:ascii="Segoe UI Emoji" w:hAnsi="Segoe UI Emoji" w:cs="Segoe UI Emoji"/>
-        </w:rPr>
-        <w:t xml:space="preserve">Créer une </w:t>
-      </w:r>
-      <w:r>
-        <w:rPr>
-          <w:rFonts w:ascii="Segoe UI Emoji" w:hAnsi="Segoe UI Emoji" w:cs="Segoe UI Emoji"/>
-          <w:b/>
-          <w:bCs/>
-        </w:rPr>
-        <w:t>table calendrier</w:t>
-      </w:r>
-      <w:r>
-        <w:rPr>
-          <w:rFonts w:ascii="Segoe UI Emoji" w:hAnsi="Segoe UI Emoji" w:cs="Segoe UI Emoji"/>
-        </w:rPr>
-        <w:t xml:space="preserve"> si analyse temporelle prévue.</w:t>
-      </w:r>
-    </w:p>
-    <w:p>
-      <w:pPr>
-        <w:numPr>
-          <w:ilvl w:val="0"/>
-          <w:numId w:val="43"/>
-        </w:numPr>
-        <w:rPr>
-          <w:rFonts w:ascii="Segoe UI Emoji" w:hAnsi="Segoe UI Emoji" w:cs="Segoe UI Emoji"/>
-        </w:rPr>
-      </w:pPr>
-      <w:r>
-        <w:rPr>
-          <w:rFonts w:ascii="Segoe UI Emoji" w:hAnsi="Segoe UI Emoji" w:cs="Segoe UI Emoji"/>
-        </w:rPr>
-        <w:lastRenderedPageBreak/>
-        <w:t xml:space="preserve">Valider par </w:t>
-      </w:r>
-      <w:r>
-        <w:rPr>
-          <w:rFonts w:ascii="Segoe UI Emoji" w:hAnsi="Segoe UI Emoji" w:cs="Segoe UI Emoji"/>
-          <w:b/>
-          <w:bCs/>
-        </w:rPr>
-        <w:t>Fermer et appliquer</w:t>
-      </w:r>
-      <w:r>
-        <w:rPr>
-          <w:rFonts w:ascii="Segoe UI Emoji" w:hAnsi="Segoe UI Emoji" w:cs="Segoe UI Emoji"/>
-        </w:rPr>
-        <w:t>.</w:t>
-      </w:r>
-    </w:p>
-    <w:p>
-      <w:pPr>
-        <w:rPr>
-          <w:rFonts w:ascii="Segoe UI Emoji" w:hAnsi="Segoe UI Emoji" w:cs="Segoe UI Emoji"/>
-        </w:rPr>
-      </w:pPr>
-      <w:r>
-        <w:rPr>
-          <w:rFonts w:ascii="Segoe UI Emoji" w:hAnsi="Segoe UI Emoji" w:cs="Segoe UI Emoji"/>
-          <w:b/>
-          <w:bCs/>
-        </w:rPr>
-        <w:t>Exemple</w:t>
-      </w:r>
-    </w:p>
-    <w:p>
-      <w:pPr>
-        <w:numPr>
-          <w:ilvl w:val="0"/>
-          <w:numId w:val="44"/>
-        </w:numPr>
-        <w:rPr>
-          <w:rFonts w:ascii="Segoe UI Emoji" w:hAnsi="Segoe UI Emoji" w:cs="Segoe UI Emoji"/>
-        </w:rPr>
-      </w:pPr>
-      <w:r>
-        <w:rPr>
-          <w:rFonts w:ascii="Segoe UI Emoji" w:hAnsi="Segoe UI Emoji" w:cs="Segoe UI Emoji"/>
-        </w:rPr>
-        <w:t>“1 245,50” détecté comme texte → changer type de données avec culture “</w:t>
-      </w:r>
-      <w:proofErr w:type="spellStart"/>
-      <w:r>
-        <w:rPr>
-          <w:rFonts w:ascii="Segoe UI Emoji" w:hAnsi="Segoe UI Emoji" w:cs="Segoe UI Emoji"/>
-        </w:rPr>
-        <w:t>fr-FR</w:t>
-      </w:r>
-      <w:proofErr w:type="spellEnd"/>
-      <w:r>
-        <w:rPr>
-          <w:rFonts w:ascii="Segoe UI Emoji" w:hAnsi="Segoe UI Emoji" w:cs="Segoe UI Emoji"/>
-        </w:rPr>
-        <w:t>”.</w:t>
-      </w:r>
-    </w:p>
-    <w:p>
-      <w:pPr>
-        <w:rPr>
-          <w:rFonts w:ascii="Segoe UI Emoji" w:hAnsi="Segoe UI Emoji" w:cs="Segoe UI Emoji"/>
-        </w:rPr>
-      </w:pPr>
-      <w:r>
-        <w:rPr>
-          <w:rFonts w:ascii="Segoe UI Emoji" w:hAnsi="Segoe UI Emoji" w:cs="Segoe UI Emoji"/>
-          <w:b/>
-          <w:bCs/>
-        </w:rPr>
-        <w:t>Contrôles qualité</w:t>
-      </w:r>
-    </w:p>
-    <w:p>
-      <w:pPr>
-        <w:numPr>
-          <w:ilvl w:val="0"/>
-          <w:numId w:val="45"/>
-        </w:numPr>
-        <w:rPr>
-          <w:rFonts w:ascii="Segoe UI Emoji" w:hAnsi="Segoe UI Emoji" w:cs="Segoe UI Emoji"/>
-        </w:rPr>
-      </w:pPr>
-      <w:r>
-        <w:rPr>
-          <w:rFonts w:ascii="Segoe UI Emoji" w:hAnsi="Segoe UI Emoji" w:cs="Segoe UI Emoji"/>
-        </w:rPr>
-        <w:t>Pas de mélange texte/nombre dans une même colonne.</w:t>
-      </w:r>
-    </w:p>
-    <w:p>
-      <w:pPr>
-        <w:numPr>
-          <w:ilvl w:val="0"/>
-          <w:numId w:val="45"/>
-        </w:numPr>
-        <w:rPr>
-          <w:rFonts w:ascii="Segoe UI Emoji" w:hAnsi="Segoe UI Emoji" w:cs="Segoe UI Emoji"/>
-        </w:rPr>
-      </w:pPr>
-      <w:r>
-        <w:rPr>
-          <w:rFonts w:ascii="Segoe UI Emoji" w:hAnsi="Segoe UI Emoji" w:cs="Segoe UI Emoji"/>
-        </w:rPr>
-        <w:t>Pas de doublons sur les clés.</w:t>
-      </w:r>
-    </w:p>
-    <w:p>
-      <w:pPr>
-        <w:rPr>
-          <w:rFonts w:ascii="Segoe UI Emoji" w:hAnsi="Segoe UI Emoji" w:cs="Segoe UI Emoji"/>
-        </w:rPr>
-      </w:pPr>
-      <w:r>
-        <w:rPr>
-          <w:rFonts w:ascii="Segoe UI Emoji" w:hAnsi="Segoe UI Emoji" w:cs="Segoe UI Emoji"/>
-          <w:b/>
-          <w:bCs/>
-        </w:rPr>
-        <w:t>Erreurs fréquentes</w:t>
-      </w:r>
-    </w:p>
-    <w:p>
-      <w:pPr>
-        <w:numPr>
-          <w:ilvl w:val="0"/>
-          <w:numId w:val="46"/>
-        </w:numPr>
-        <w:rPr>
-          <w:rFonts w:ascii="Segoe UI Emoji" w:hAnsi="Segoe UI Emoji" w:cs="Segoe UI Emoji"/>
-        </w:rPr>
-      </w:pPr>
-      <w:r>
-        <w:rPr>
-          <w:rFonts w:ascii="Segoe UI Emoji" w:hAnsi="Segoe UI Emoji" w:cs="Segoe UI Emoji"/>
-        </w:rPr>
-        <w:t>Dates mal interprétées → vérifier paramètre de culture.</w:t>
-      </w:r>
-    </w:p>
-    <w:p>
-      <w:pPr>
-        <w:rPr>
-          <w:rFonts w:ascii="Segoe UI Emoji" w:hAnsi="Segoe UI Emoji" w:cs="Segoe UI Emoji"/>
-        </w:rPr>
-      </w:pPr>
-      <w:r>
-        <w:rPr>
-          <w:rFonts w:ascii="Segoe UI Emoji" w:hAnsi="Segoe UI Emoji" w:cs="Segoe UI Emoji"/>
-          <w:b/>
-          <w:bCs/>
-        </w:rPr>
-        <w:t>Sources &amp; Dépannage</w:t>
-      </w:r>
-    </w:p>
-    <w:p>
-      <w:pPr>
-        <w:numPr>
-          <w:ilvl w:val="0"/>
-          <w:numId w:val="47"/>
-        </w:numPr>
-        <w:rPr>
-          <w:rFonts w:ascii="Segoe UI Emoji" w:hAnsi="Segoe UI Emoji" w:cs="Segoe UI Emoji"/>
-        </w:rPr>
-      </w:pPr>
       <w:hyperlink r:id="rId10" w:history="1">
         <w:r>
           <w:rPr>
             <w:rStyle w:val="Lienhypertexte"/>
             <w:rFonts w:ascii="Segoe UI Emoji" w:hAnsi="Segoe UI Emoji" w:cs="Segoe UI Emoji"/>
           </w:rPr>
-          <w:t xml:space="preserve">Documentation Power </w:t>
+          <w:t>Nettoyage des données dans Power Query</w:t>
         </w:r>
-        <w:proofErr w:type="spellStart"/>
+      </w:hyperlink>
+    </w:p>
+    <w:p>
+      <w:pPr>
+        <w:rPr>
+          <w:rFonts w:ascii="Segoe UI Emoji" w:hAnsi="Segoe UI Emoji" w:cs="Segoe UI Emoji"/>
+        </w:rPr>
+      </w:pPr>
+      <w:r>
+        <w:rPr>
+          <w:rFonts w:ascii="Segoe UI Emoji" w:hAnsi="Segoe UI Emoji" w:cs="Segoe UI Emoji"/>
+        </w:rPr>
+        <w:pict w14:anchorId="377F6779">
+          <v:rect id="_x0000_i1027" style="width:0;height:1.5pt" o:hralign="center" o:hrstd="t" o:hr="t" fillcolor="#a0a0a0" stroked="f"/>
+        </w:pict>
+      </w:r>
+    </w:p>
+    <w:p>
+      <w:pPr>
+        <w:rPr>
+          <w:rFonts w:ascii="Segoe UI Emoji" w:hAnsi="Segoe UI Emoji" w:cs="Segoe UI Emoji"/>
+          <w:b/>
+          <w:bCs/>
+        </w:rPr>
+      </w:pPr>
+      <w:r>
+        <w:rPr>
+          <w:rFonts w:ascii="Segoe UI Emoji" w:hAnsi="Segoe UI Emoji" w:cs="Segoe UI Emoji"/>
+          <w:b/>
+          <w:bCs/>
+        </w:rPr>
+        <w:t>Étape 3 — Nettoyage et transformation (Power Query)</w:t>
+      </w:r>
+    </w:p>
+    <w:p>
+      <w:pPr>
+        <w:rPr>
+          <w:rFonts w:ascii="Segoe UI Emoji" w:hAnsi="Segoe UI Emoji" w:cs="Segoe UI Emoji"/>
+        </w:rPr>
+      </w:pPr>
+      <w:r>
+        <w:rPr>
+          <w:rFonts w:ascii="Segoe UI Emoji" w:hAnsi="Segoe UI Emoji" w:cs="Segoe UI Emoji"/>
+          <w:b/>
+          <w:bCs/>
+        </w:rPr>
+        <w:t>Procédure détaillée</w:t>
+      </w:r>
+    </w:p>
+    <w:p>
+      <w:pPr>
+        <w:numPr>
+          <w:ilvl w:val="0"/>
+          <w:numId w:val="43"/>
+        </w:numPr>
+        <w:rPr>
+          <w:rFonts w:ascii="Segoe UI Emoji" w:hAnsi="Segoe UI Emoji" w:cs="Segoe UI Emoji"/>
+        </w:rPr>
+      </w:pPr>
+      <w:r>
+        <w:rPr>
+          <w:rFonts w:ascii="Segoe UI Emoji" w:hAnsi="Segoe UI Emoji" w:cs="Segoe UI Emoji"/>
+        </w:rPr>
+        <w:t>Définir le type de chaque colonne (Date, Décimal, Entier, Texte).</w:t>
+      </w:r>
+    </w:p>
+    <w:p>
+      <w:pPr>
+        <w:numPr>
+          <w:ilvl w:val="0"/>
+          <w:numId w:val="43"/>
+        </w:numPr>
+        <w:rPr>
+          <w:rFonts w:ascii="Segoe UI Emoji" w:hAnsi="Segoe UI Emoji" w:cs="Segoe UI Emoji"/>
+        </w:rPr>
+      </w:pPr>
+      <w:r>
+        <w:rPr>
+          <w:rFonts w:ascii="Segoe UI Emoji" w:hAnsi="Segoe UI Emoji" w:cs="Segoe UI Emoji"/>
+        </w:rPr>
+        <w:t>Supprimer colonnes inutiles.</w:t>
+      </w:r>
+    </w:p>
+    <w:p>
+      <w:pPr>
+        <w:numPr>
+          <w:ilvl w:val="0"/>
+          <w:numId w:val="43"/>
+        </w:numPr>
+        <w:rPr>
+          <w:rFonts w:ascii="Segoe UI Emoji" w:hAnsi="Segoe UI Emoji" w:cs="Segoe UI Emoji"/>
+        </w:rPr>
+      </w:pPr>
+      <w:r>
+        <w:rPr>
+          <w:rFonts w:ascii="Segoe UI Emoji" w:hAnsi="Segoe UI Emoji" w:cs="Segoe UI Emoji"/>
+        </w:rPr>
+        <w:lastRenderedPageBreak/>
+        <w:t>Nettoyer les valeurs (“Paris</w:t>
+      </w:r>
+      <w:r>
+        <w:rPr>
+          <w:rFonts w:ascii="Arial" w:hAnsi="Arial" w:cs="Arial"/>
+        </w:rPr>
+        <w:t> </w:t>
+      </w:r>
+      <w:r>
+        <w:rPr>
+          <w:rFonts w:ascii="Segoe UI Emoji" w:hAnsi="Segoe UI Emoji" w:cs="Segoe UI Emoji"/>
+        </w:rPr>
+        <w:t xml:space="preserve"> ” → “Paris”).</w:t>
+      </w:r>
+    </w:p>
+    <w:p>
+      <w:pPr>
+        <w:numPr>
+          <w:ilvl w:val="0"/>
+          <w:numId w:val="43"/>
+        </w:numPr>
+        <w:rPr>
+          <w:rFonts w:ascii="Segoe UI Emoji" w:hAnsi="Segoe UI Emoji" w:cs="Segoe UI Emoji"/>
+        </w:rPr>
+      </w:pPr>
+      <w:r>
+        <w:rPr>
+          <w:rFonts w:ascii="Segoe UI Emoji" w:hAnsi="Segoe UI Emoji" w:cs="Segoe UI Emoji"/>
+        </w:rPr>
+        <w:t>Remplacer codes manquants (N/A, —) par null.</w:t>
+      </w:r>
+    </w:p>
+    <w:p>
+      <w:pPr>
+        <w:numPr>
+          <w:ilvl w:val="0"/>
+          <w:numId w:val="43"/>
+        </w:numPr>
+        <w:rPr>
+          <w:rFonts w:ascii="Segoe UI Emoji" w:hAnsi="Segoe UI Emoji" w:cs="Segoe UI Emoji"/>
+        </w:rPr>
+      </w:pPr>
+      <w:r>
+        <w:rPr>
+          <w:rFonts w:ascii="Segoe UI Emoji" w:hAnsi="Segoe UI Emoji" w:cs="Segoe UI Emoji"/>
+        </w:rPr>
+        <w:t>Renommer colonnes pour clarté et cohérence.</w:t>
+      </w:r>
+    </w:p>
+    <w:p>
+      <w:pPr>
+        <w:numPr>
+          <w:ilvl w:val="0"/>
+          <w:numId w:val="43"/>
+        </w:numPr>
+        <w:rPr>
+          <w:rFonts w:ascii="Segoe UI Emoji" w:hAnsi="Segoe UI Emoji" w:cs="Segoe UI Emoji"/>
+        </w:rPr>
+      </w:pPr>
+      <w:r>
+        <w:rPr>
+          <w:rFonts w:ascii="Segoe UI Emoji" w:hAnsi="Segoe UI Emoji" w:cs="Segoe UI Emoji"/>
+        </w:rPr>
+        <w:t xml:space="preserve">Créer une </w:t>
+      </w:r>
+      <w:r>
+        <w:rPr>
+          <w:rFonts w:ascii="Segoe UI Emoji" w:hAnsi="Segoe UI Emoji" w:cs="Segoe UI Emoji"/>
+          <w:b/>
+          <w:bCs/>
+        </w:rPr>
+        <w:t>table calendrier</w:t>
+      </w:r>
+      <w:r>
+        <w:rPr>
+          <w:rFonts w:ascii="Segoe UI Emoji" w:hAnsi="Segoe UI Emoji" w:cs="Segoe UI Emoji"/>
+        </w:rPr>
+        <w:t xml:space="preserve"> si analyse temporelle prévue.</w:t>
+      </w:r>
+    </w:p>
+    <w:p>
+      <w:pPr>
+        <w:numPr>
+          <w:ilvl w:val="0"/>
+          <w:numId w:val="43"/>
+        </w:numPr>
+        <w:rPr>
+          <w:rFonts w:ascii="Segoe UI Emoji" w:hAnsi="Segoe UI Emoji" w:cs="Segoe UI Emoji"/>
+        </w:rPr>
+      </w:pPr>
+      <w:r>
+        <w:rPr>
+          <w:rFonts w:ascii="Segoe UI Emoji" w:hAnsi="Segoe UI Emoji" w:cs="Segoe UI Emoji"/>
+        </w:rPr>
+        <w:t xml:space="preserve">Valider par </w:t>
+      </w:r>
+      <w:r>
+        <w:rPr>
+          <w:rFonts w:ascii="Segoe UI Emoji" w:hAnsi="Segoe UI Emoji" w:cs="Segoe UI Emoji"/>
+          <w:b/>
+          <w:bCs/>
+        </w:rPr>
+        <w:t>Fermer et appliquer</w:t>
+      </w:r>
+      <w:r>
+        <w:rPr>
+          <w:rFonts w:ascii="Segoe UI Emoji" w:hAnsi="Segoe UI Emoji" w:cs="Segoe UI Emoji"/>
+        </w:rPr>
+        <w:t>.</w:t>
+      </w:r>
+    </w:p>
+    <w:p>
+      <w:pPr>
+        <w:rPr>
+          <w:rFonts w:ascii="Segoe UI Emoji" w:hAnsi="Segoe UI Emoji" w:cs="Segoe UI Emoji"/>
+        </w:rPr>
+      </w:pPr>
+      <w:r>
+        <w:rPr>
+          <w:rFonts w:ascii="Segoe UI Emoji" w:hAnsi="Segoe UI Emoji" w:cs="Segoe UI Emoji"/>
+          <w:b/>
+          <w:bCs/>
+        </w:rPr>
+        <w:t>Exemple</w:t>
+      </w:r>
+    </w:p>
+    <w:p>
+      <w:pPr>
+        <w:numPr>
+          <w:ilvl w:val="0"/>
+          <w:numId w:val="44"/>
+        </w:numPr>
+        <w:rPr>
+          <w:rFonts w:ascii="Segoe UI Emoji" w:hAnsi="Segoe UI Emoji" w:cs="Segoe UI Emoji"/>
+        </w:rPr>
+      </w:pPr>
+      <w:r>
+        <w:rPr>
+          <w:rFonts w:ascii="Segoe UI Emoji" w:hAnsi="Segoe UI Emoji" w:cs="Segoe UI Emoji"/>
+        </w:rPr>
+        <w:t>“1 245,50” détecté comme texte → changer type de données avec culture “fr-FR”.</w:t>
+      </w:r>
+    </w:p>
+    <w:p>
+      <w:pPr>
+        <w:rPr>
+          <w:rFonts w:ascii="Segoe UI Emoji" w:hAnsi="Segoe UI Emoji" w:cs="Segoe UI Emoji"/>
+        </w:rPr>
+      </w:pPr>
+      <w:r>
+        <w:rPr>
+          <w:rFonts w:ascii="Segoe UI Emoji" w:hAnsi="Segoe UI Emoji" w:cs="Segoe UI Emoji"/>
+          <w:b/>
+          <w:bCs/>
+        </w:rPr>
+        <w:t>Contrôles qualité</w:t>
+      </w:r>
+    </w:p>
+    <w:p>
+      <w:pPr>
+        <w:numPr>
+          <w:ilvl w:val="0"/>
+          <w:numId w:val="45"/>
+        </w:numPr>
+        <w:rPr>
+          <w:rFonts w:ascii="Segoe UI Emoji" w:hAnsi="Segoe UI Emoji" w:cs="Segoe UI Emoji"/>
+        </w:rPr>
+      </w:pPr>
+      <w:r>
+        <w:rPr>
+          <w:rFonts w:ascii="Segoe UI Emoji" w:hAnsi="Segoe UI Emoji" w:cs="Segoe UI Emoji"/>
+        </w:rPr>
+        <w:t>Pas de mélange texte/nombre dans une même colonne.</w:t>
+      </w:r>
+    </w:p>
+    <w:p>
+      <w:pPr>
+        <w:numPr>
+          <w:ilvl w:val="0"/>
+          <w:numId w:val="45"/>
+        </w:numPr>
+        <w:rPr>
+          <w:rFonts w:ascii="Segoe UI Emoji" w:hAnsi="Segoe UI Emoji" w:cs="Segoe UI Emoji"/>
+        </w:rPr>
+      </w:pPr>
+      <w:r>
+        <w:rPr>
+          <w:rFonts w:ascii="Segoe UI Emoji" w:hAnsi="Segoe UI Emoji" w:cs="Segoe UI Emoji"/>
+        </w:rPr>
+        <w:t>Pas de doublons sur les clés.</w:t>
+      </w:r>
+    </w:p>
+    <w:p>
+      <w:pPr>
+        <w:rPr>
+          <w:rFonts w:ascii="Segoe UI Emoji" w:hAnsi="Segoe UI Emoji" w:cs="Segoe UI Emoji"/>
+        </w:rPr>
+      </w:pPr>
+      <w:r>
+        <w:rPr>
+          <w:rFonts w:ascii="Segoe UI Emoji" w:hAnsi="Segoe UI Emoji" w:cs="Segoe UI Emoji"/>
+          <w:b/>
+          <w:bCs/>
+        </w:rPr>
+        <w:t>Erreurs fréquentes</w:t>
+      </w:r>
+    </w:p>
+    <w:p>
+      <w:pPr>
+        <w:numPr>
+          <w:ilvl w:val="0"/>
+          <w:numId w:val="46"/>
+        </w:numPr>
+        <w:rPr>
+          <w:rFonts w:ascii="Segoe UI Emoji" w:hAnsi="Segoe UI Emoji" w:cs="Segoe UI Emoji"/>
+        </w:rPr>
+      </w:pPr>
+      <w:r>
+        <w:rPr>
+          <w:rFonts w:ascii="Segoe UI Emoji" w:hAnsi="Segoe UI Emoji" w:cs="Segoe UI Emoji"/>
+        </w:rPr>
+        <w:t>Dates mal interprétées → vérifier paramètre de culture.</w:t>
+      </w:r>
+    </w:p>
+    <w:p>
+      <w:pPr>
+        <w:rPr>
+          <w:rFonts w:ascii="Segoe UI Emoji" w:hAnsi="Segoe UI Emoji" w:cs="Segoe UI Emoji"/>
+        </w:rPr>
+      </w:pPr>
+      <w:r>
+        <w:rPr>
+          <w:rFonts w:ascii="Segoe UI Emoji" w:hAnsi="Segoe UI Emoji" w:cs="Segoe UI Emoji"/>
+          <w:b/>
+          <w:bCs/>
+        </w:rPr>
+        <w:t>Sources &amp; Dépannage</w:t>
+      </w:r>
+    </w:p>
+    <w:p>
+      <w:pPr>
+        <w:numPr>
+          <w:ilvl w:val="0"/>
+          <w:numId w:val="47"/>
+        </w:numPr>
+        <w:rPr>
+          <w:rFonts w:ascii="Segoe UI Emoji" w:hAnsi="Segoe UI Emoji" w:cs="Segoe UI Emoji"/>
+        </w:rPr>
+      </w:pPr>
+      <w:hyperlink r:id="rId11" w:history="1">
         <w:r>
           <w:rPr>
             <w:rStyle w:val="Lienhypertexte"/>
             <w:rFonts w:ascii="Segoe UI Emoji" w:hAnsi="Segoe UI Emoji" w:cs="Segoe UI Emoji"/>
           </w:rPr>
-          <w:t>Query</w:t>
+          <w:t>Documentation Power Query</w:t>
         </w:r>
-        <w:proofErr w:type="spellEnd"/>
       </w:hyperlink>
     </w:p>
     <w:p>
@@ -1207,7 +1166,7 @@
           <w:rFonts w:ascii="Segoe UI Emoji" w:hAnsi="Segoe UI Emoji" w:cs="Segoe UI Emoji"/>
         </w:rPr>
       </w:pPr>
-      <w:hyperlink r:id="rId11" w:history="1">
+      <w:hyperlink r:id="rId12" w:history="1">
         <w:r>
           <w:rPr>
             <w:rStyle w:val="Lienhypertexte"/>
@@ -1228,7 +1187,7 @@
           <w:rFonts w:ascii="Segoe UI Emoji" w:hAnsi="Segoe UI Emoji" w:cs="Segoe UI Emoji"/>
         </w:rPr>
         <w:pict w14:anchorId="2DB16633">
-          <v:rect id="_x0000_i1278" style="width:0;height:1.5pt" o:hralign="center" o:hrstd="t" o:hr="t" fillcolor="#a0a0a0" stroked="f"/>
+          <v:rect id="_x0000_i1028" style="width:0;height:1.5pt" o:hralign="center" o:hrstd="t" o:hr="t" fillcolor="#a0a0a0" stroked="f"/>
         </w:pict>
       </w:r>
     </w:p>
@@ -1461,77 +1420,11 @@
           <w:rFonts w:ascii="Segoe UI Emoji" w:hAnsi="Segoe UI Emoji" w:cs="Segoe UI Emoji"/>
         </w:rPr>
       </w:pPr>
-      <w:proofErr w:type="spellStart"/>
-      <w:r>
-        <w:rPr>
-          <w:rFonts w:ascii="Segoe UI Emoji" w:hAnsi="Segoe UI Emoji" w:cs="Segoe UI Emoji"/>
-        </w:rPr>
-        <w:t>D_</w:t>
-      </w:r>
-      <w:proofErr w:type="gramStart"/>
-      <w:r>
-        <w:rPr>
-          <w:rFonts w:ascii="Segoe UI Emoji" w:hAnsi="Segoe UI Emoji" w:cs="Segoe UI Emoji"/>
-        </w:rPr>
-        <w:t>Produit</w:t>
-      </w:r>
-      <w:proofErr w:type="spellEnd"/>
-      <w:r>
-        <w:rPr>
-          <w:rFonts w:ascii="Segoe UI Emoji" w:hAnsi="Segoe UI Emoji" w:cs="Segoe UI Emoji"/>
-        </w:rPr>
-        <w:t>[</w:t>
-      </w:r>
-      <w:proofErr w:type="spellStart"/>
-      <w:proofErr w:type="gramEnd"/>
-      <w:r>
-        <w:rPr>
-          <w:rFonts w:ascii="Segoe UI Emoji" w:hAnsi="Segoe UI Emoji" w:cs="Segoe UI Emoji"/>
-        </w:rPr>
-        <w:t>ProduitID</w:t>
-      </w:r>
-      <w:proofErr w:type="spellEnd"/>
-      <w:r>
-        <w:rPr>
-          <w:rFonts w:ascii="Segoe UI Emoji" w:hAnsi="Segoe UI Emoji" w:cs="Segoe UI Emoji"/>
-        </w:rPr>
-        <w:t xml:space="preserve">] (unique) → </w:t>
-      </w:r>
-      <w:proofErr w:type="spellStart"/>
-      <w:r>
-        <w:rPr>
-          <w:rFonts w:ascii="Segoe UI Emoji" w:hAnsi="Segoe UI Emoji" w:cs="Segoe UI Emoji"/>
-        </w:rPr>
-        <w:t>F_</w:t>
-      </w:r>
-      <w:proofErr w:type="gramStart"/>
-      <w:r>
-        <w:rPr>
-          <w:rFonts w:ascii="Segoe UI Emoji" w:hAnsi="Segoe UI Emoji" w:cs="Segoe UI Emoji"/>
-        </w:rPr>
-        <w:t>Ventes</w:t>
-      </w:r>
-      <w:proofErr w:type="spellEnd"/>
-      <w:r>
-        <w:rPr>
-          <w:rFonts w:ascii="Segoe UI Emoji" w:hAnsi="Segoe UI Emoji" w:cs="Segoe UI Emoji"/>
-        </w:rPr>
-        <w:t>[</w:t>
-      </w:r>
-      <w:proofErr w:type="spellStart"/>
-      <w:proofErr w:type="gramEnd"/>
-      <w:r>
-        <w:rPr>
-          <w:rFonts w:ascii="Segoe UI Emoji" w:hAnsi="Segoe UI Emoji" w:cs="Segoe UI Emoji"/>
-        </w:rPr>
-        <w:t>ProduitID</w:t>
-      </w:r>
-      <w:proofErr w:type="spellEnd"/>
-      <w:r>
-        <w:rPr>
-          <w:rFonts w:ascii="Segoe UI Emoji" w:hAnsi="Segoe UI Emoji" w:cs="Segoe UI Emoji"/>
-        </w:rPr>
-        <w:t>] (répété).</w:t>
+      <w:r>
+        <w:rPr>
+          <w:rFonts w:ascii="Segoe UI Emoji" w:hAnsi="Segoe UI Emoji" w:cs="Segoe UI Emoji"/>
+        </w:rPr>
+        <w:t>D_Produit[ProduitID] (unique) → F_Ventes[ProduitID] (répété).</w:t>
       </w:r>
     </w:p>
     <w:p>
@@ -1546,6 +1439,7 @@
           <w:b/>
           <w:bCs/>
         </w:rPr>
+        <w:lastRenderedPageBreak/>
         <w:t>Contrôles qualité</w:t>
       </w:r>
     </w:p>
@@ -1580,35 +1474,7 @@
         <w:rPr>
           <w:rFonts w:ascii="Segoe UI Emoji" w:hAnsi="Segoe UI Emoji" w:cs="Segoe UI Emoji"/>
         </w:rPr>
-        <w:t>Pas de “</w:t>
-      </w:r>
-      <w:proofErr w:type="spellStart"/>
-      <w:r>
-        <w:rPr>
-          <w:rFonts w:ascii="Segoe UI Emoji" w:hAnsi="Segoe UI Emoji" w:cs="Segoe UI Emoji"/>
-        </w:rPr>
-        <w:t>Many</w:t>
-      </w:r>
-      <w:proofErr w:type="spellEnd"/>
-      <w:r>
-        <w:rPr>
-          <w:rFonts w:ascii="Segoe UI Emoji" w:hAnsi="Segoe UI Emoji" w:cs="Segoe UI Emoji"/>
-        </w:rPr>
-        <w:t>-to-</w:t>
-      </w:r>
-      <w:proofErr w:type="spellStart"/>
-      <w:r>
-        <w:rPr>
-          <w:rFonts w:ascii="Segoe UI Emoji" w:hAnsi="Segoe UI Emoji" w:cs="Segoe UI Emoji"/>
-        </w:rPr>
-        <w:t>many</w:t>
-      </w:r>
-      <w:proofErr w:type="spellEnd"/>
-      <w:r>
-        <w:rPr>
-          <w:rFonts w:ascii="Segoe UI Emoji" w:hAnsi="Segoe UI Emoji" w:cs="Segoe UI Emoji"/>
-        </w:rPr>
-        <w:t>” sauf nécessité métier.</w:t>
+        <w:t>Pas de “Many-to-many” sauf nécessité métier.</w:t>
       </w:r>
     </w:p>
     <w:p>
@@ -1636,7 +1502,7 @@
           <w:rFonts w:ascii="Segoe UI Emoji" w:hAnsi="Segoe UI Emoji" w:cs="Segoe UI Emoji"/>
         </w:rPr>
       </w:pPr>
-      <w:hyperlink r:id="rId12" w:history="1">
+      <w:hyperlink r:id="rId13" w:history="1">
         <w:r>
           <w:rPr>
             <w:rStyle w:val="Lienhypertexte"/>
@@ -1656,7 +1522,7 @@
           <w:rFonts w:ascii="Segoe UI Emoji" w:hAnsi="Segoe UI Emoji" w:cs="Segoe UI Emoji"/>
         </w:rPr>
       </w:pPr>
-      <w:hyperlink r:id="rId13" w:history="1">
+      <w:hyperlink r:id="rId14" w:history="1">
         <w:r>
           <w:rPr>
             <w:rStyle w:val="Lienhypertexte"/>
@@ -1677,7 +1543,7 @@
           <w:rFonts w:ascii="Segoe UI Emoji" w:hAnsi="Segoe UI Emoji" w:cs="Segoe UI Emoji"/>
         </w:rPr>
         <w:pict w14:anchorId="09AA72D2">
-          <v:rect id="_x0000_i1279" style="width:0;height:1.5pt" o:hralign="center" o:hrstd="t" o:hr="t" fillcolor="#a0a0a0" stroked="f"/>
+          <v:rect id="_x0000_i1029" style="width:0;height:1.5pt" o:hralign="center" o:hrstd="t" o:hr="t" fillcolor="#a0a0a0" stroked="f"/>
         </w:pict>
       </w:r>
     </w:p>
@@ -1761,35 +1627,7 @@
         <w:rPr>
           <w:rFonts w:ascii="Segoe UI Emoji" w:hAnsi="Segoe UI Emoji" w:cs="Segoe UI Emoji"/>
         </w:rPr>
-        <w:t>CA = SUM(</w:t>
-      </w:r>
-      <w:proofErr w:type="spellStart"/>
-      <w:r>
-        <w:rPr>
-          <w:rFonts w:ascii="Segoe UI Emoji" w:hAnsi="Segoe UI Emoji" w:cs="Segoe UI Emoji"/>
-        </w:rPr>
-        <w:t>F_</w:t>
-      </w:r>
-      <w:proofErr w:type="gramStart"/>
-      <w:r>
-        <w:rPr>
-          <w:rFonts w:ascii="Segoe UI Emoji" w:hAnsi="Segoe UI Emoji" w:cs="Segoe UI Emoji"/>
-        </w:rPr>
-        <w:t>Ventes</w:t>
-      </w:r>
-      <w:proofErr w:type="spellEnd"/>
-      <w:r>
-        <w:rPr>
-          <w:rFonts w:ascii="Segoe UI Emoji" w:hAnsi="Segoe UI Emoji" w:cs="Segoe UI Emoji"/>
-        </w:rPr>
-        <w:t>[</w:t>
-      </w:r>
-      <w:proofErr w:type="gramEnd"/>
-      <w:r>
-        <w:rPr>
-          <w:rFonts w:ascii="Segoe UI Emoji" w:hAnsi="Segoe UI Emoji" w:cs="Segoe UI Emoji"/>
-        </w:rPr>
-        <w:t>Montant])</w:t>
+        <w:t>CA = SUM(F_Ventes[Montant])</w:t>
       </w:r>
     </w:p>
     <w:p>
@@ -1924,7 +1762,7 @@
           <w:rFonts w:ascii="Segoe UI Emoji" w:hAnsi="Segoe UI Emoji" w:cs="Segoe UI Emoji"/>
         </w:rPr>
       </w:pPr>
-      <w:hyperlink r:id="rId14" w:history="1">
+      <w:hyperlink r:id="rId15" w:history="1">
         <w:r>
           <w:rPr>
             <w:rStyle w:val="Lienhypertexte"/>
@@ -1944,7 +1782,7 @@
           <w:rFonts w:ascii="Segoe UI Emoji" w:hAnsi="Segoe UI Emoji" w:cs="Segoe UI Emoji"/>
         </w:rPr>
       </w:pPr>
-      <w:hyperlink r:id="rId15" w:history="1">
+      <w:hyperlink r:id="rId16" w:history="1">
         <w:r>
           <w:rPr>
             <w:rStyle w:val="Lienhypertexte"/>
@@ -1965,7 +1803,7 @@
           <w:rFonts w:ascii="Segoe UI Emoji" w:hAnsi="Segoe UI Emoji" w:cs="Segoe UI Emoji"/>
         </w:rPr>
         <w:pict w14:anchorId="6B038FEB">
-          <v:rect id="_x0000_i1280" style="width:0;height:1.5pt" o:hralign="center" o:hrstd="t" o:hr="t" fillcolor="#a0a0a0" stroked="f"/>
+          <v:rect id="_x0000_i1030" style="width:0;height:1.5pt" o:hralign="center" o:hrstd="t" o:hr="t" fillcolor="#a0a0a0" stroked="f"/>
         </w:pict>
       </w:r>
     </w:p>
@@ -2120,6 +1958,7 @@
           <w:b/>
           <w:bCs/>
         </w:rPr>
+        <w:lastRenderedPageBreak/>
         <w:t>Exemple</w:t>
       </w:r>
     </w:p>
@@ -2165,7 +2004,7 @@
           <w:rFonts w:ascii="Segoe UI Emoji" w:hAnsi="Segoe UI Emoji" w:cs="Segoe UI Emoji"/>
         </w:rPr>
       </w:pPr>
-      <w:hyperlink r:id="rId16" w:history="1">
+      <w:hyperlink r:id="rId17" w:history="1">
         <w:r>
           <w:rPr>
             <w:rStyle w:val="Lienhypertexte"/>
@@ -2185,9 +2024,8 @@
         <w:rPr>
           <w:rFonts w:ascii="Segoe UI Emoji" w:hAnsi="Segoe UI Emoji" w:cs="Segoe UI Emoji"/>
         </w:rPr>
-        <w:lastRenderedPageBreak/>
         <w:pict w14:anchorId="02B51BF7">
-          <v:rect id="_x0000_i1281" style="width:0;height:1.5pt" o:hralign="center" o:hrstd="t" o:hr="t" fillcolor="#a0a0a0" stroked="f"/>
+          <v:rect id="_x0000_i1031" style="width:0;height:1.5pt" o:hralign="center" o:hrstd="t" o:hr="t" fillcolor="#a0a0a0" stroked="f"/>
         </w:pict>
       </w:r>
     </w:p>
@@ -2282,7 +2120,7 @@
           <w:rFonts w:ascii="Segoe UI Emoji" w:hAnsi="Segoe UI Emoji" w:cs="Segoe UI Emoji"/>
         </w:rPr>
       </w:pPr>
-      <w:hyperlink r:id="rId17" w:history="1">
+      <w:hyperlink r:id="rId18" w:history="1">
         <w:r>
           <w:rPr>
             <w:rStyle w:val="Lienhypertexte"/>
@@ -2303,7 +2141,7 @@
           <w:rFonts w:ascii="Segoe UI Emoji" w:hAnsi="Segoe UI Emoji" w:cs="Segoe UI Emoji"/>
         </w:rPr>
         <w:pict w14:anchorId="78FE944A">
-          <v:rect id="_x0000_i1282" style="width:0;height:1.5pt" o:hralign="center" o:hrstd="t" o:hr="t" fillcolor="#a0a0a0" stroked="f"/>
+          <v:rect id="_x0000_i1032" style="width:0;height:1.5pt" o:hralign="center" o:hrstd="t" o:hr="t" fillcolor="#a0a0a0" stroked="f"/>
         </w:pict>
       </w:r>
     </w:p>
@@ -2398,7 +2236,7 @@
           <w:rFonts w:ascii="Segoe UI Emoji" w:hAnsi="Segoe UI Emoji" w:cs="Segoe UI Emoji"/>
         </w:rPr>
       </w:pPr>
-      <w:hyperlink r:id="rId18" w:history="1">
+      <w:hyperlink r:id="rId19" w:history="1">
         <w:r>
           <w:rPr>
             <w:rStyle w:val="Lienhypertexte"/>
@@ -2419,7 +2257,7 @@
           <w:rFonts w:ascii="Segoe UI Emoji" w:hAnsi="Segoe UI Emoji" w:cs="Segoe UI Emoji"/>
         </w:rPr>
         <w:pict w14:anchorId="598BD89D">
-          <v:rect id="_x0000_i1283" style="width:0;height:1.5pt" o:hralign="center" o:hrstd="t" o:hr="t" fillcolor="#a0a0a0" stroked="f"/>
+          <v:rect id="_x0000_i1033" style="width:0;height:1.5pt" o:hralign="center" o:hrstd="t" o:hr="t" fillcolor="#a0a0a0" stroked="f"/>
         </w:pict>
       </w:r>
     </w:p>
@@ -2514,7 +2352,7 @@
           <w:rFonts w:ascii="Segoe UI Emoji" w:hAnsi="Segoe UI Emoji" w:cs="Segoe UI Emoji"/>
         </w:rPr>
       </w:pPr>
-      <w:hyperlink r:id="rId19" w:history="1">
+      <w:hyperlink r:id="rId20" w:history="1">
         <w:r>
           <w:rPr>
             <w:rStyle w:val="Lienhypertexte"/>
@@ -2535,7 +2373,7 @@
           <w:rFonts w:ascii="Segoe UI Emoji" w:hAnsi="Segoe UI Emoji" w:cs="Segoe UI Emoji"/>
         </w:rPr>
         <w:pict w14:anchorId="6501E802">
-          <v:rect id="_x0000_i1284" style="width:0;height:1.5pt" o:hralign="center" o:hrstd="t" o:hr="t" fillcolor="#a0a0a0" stroked="f"/>
+          <v:rect id="_x0000_i1034" style="width:0;height:1.5pt" o:hralign="center" o:hrstd="t" o:hr="t" fillcolor="#a0a0a0" stroked="f"/>
         </w:pict>
       </w:r>
     </w:p>
@@ -2553,6 +2391,7 @@
           <w:b/>
           <w:bCs/>
         </w:rPr>
+        <w:lastRenderedPageBreak/>
         <w:t>Étape 10 — Publication</w:t>
       </w:r>
     </w:p>
@@ -2619,7 +2458,6 @@
         <w:rPr>
           <w:rFonts w:ascii="Segoe UI Emoji" w:hAnsi="Segoe UI Emoji" w:cs="Segoe UI Emoji"/>
         </w:rPr>
-        <w:lastRenderedPageBreak/>
         <w:t>Partager selon droits.</w:t>
       </w:r>
     </w:p>
@@ -2648,7 +2486,7 @@
           <w:rFonts w:ascii="Segoe UI Emoji" w:hAnsi="Segoe UI Emoji" w:cs="Segoe UI Emoji"/>
         </w:rPr>
       </w:pPr>
-      <w:hyperlink r:id="rId20" w:history="1">
+      <w:hyperlink r:id="rId21" w:history="1">
         <w:r>
           <w:rPr>
             <w:rStyle w:val="Lienhypertexte"/>
@@ -2668,7 +2506,7 @@
           <w:rFonts w:ascii="Segoe UI Emoji" w:hAnsi="Segoe UI Emoji" w:cs="Segoe UI Emoji"/>
         </w:rPr>
       </w:pPr>
-      <w:hyperlink r:id="rId21" w:history="1">
+      <w:hyperlink r:id="rId22" w:history="1">
         <w:r>
           <w:rPr>
             <w:rStyle w:val="Lienhypertexte"/>
@@ -12439,6 +12277,7 @@
   <w:style w:type="character" w:default="1" w:styleId="Policepardfaut">
     <w:name w:val="Default Paragraph Font"/>
     <w:uiPriority w:val="1"/>
+    <w:semiHidden/>
     <w:unhideWhenUsed/>
   </w:style>
   <w:style w:type="table" w:default="1" w:styleId="TableauNormal">

</xml_diff>